<commit_message>
Portfolio batch: About text, AI skills, résumé page, world links
- About uses Jose's new text; Gas Price Predictor leads Data Science.
- 'Not yet found in game' badges become 'See it in the world' buttons that open the game at that world.
- The Resume page renders the résumé as HTML (the embedded PDF did not show in every host), with Volunteer Experience.
- New AI & Agentic Engineering skills, an independent AI experience entry and two Envision bullets, mirrored in the PDF and DOCX.
- resume.json moves to src/content so the site and the résumé scripts share it.

Co-Authored-By: Claude Opus 5.5 (1M context) <noreply@anthropic.com>
Claude-Session: https://claude.ai/code/session_019AGMx5GMfQEv44ZBWwXK4A
</commit_message>
<xml_diff>
--- a/JoseLoboPortfolioResume.docx
+++ b/JoseLoboPortfolioResume.docx
@@ -31,7 +31,7 @@
     </w:p>
     <w:p>
       <w:r>
-        <w:t>Data Scientist with 3+ years of experience delivering end-to-end analytics and machine learning solutions in healthcare. Proven ability to perform data preparation, exploratory data analysis (EDA), predictive modeling, and dashboard development to support business and clinical decision-making. Strong communicator with deep expertise in SQL, Python, R, and cloud data platforms, plus a background in biology and four years of medical school.</w:t>
+        <w:t>Data Scientist with 4+ years of experience delivering end-to-end analytics and machine learning solutions in healthcare. Proven ability to perform data preparation, exploratory data analysis (EDA), predictive modeling, and dashboard development to support business and clinical decision-making. Strong communicator with deep expertise in SQL, Python, R, and cloud data platforms, plus a background in biology and four years of medical school. Hands-on with agentic coding, cloud and local large language models, RAG and LangChain, and building self-hosted AI systems and data pipelines.</w:t>
       </w:r>
     </w:p>
     <w:p>
@@ -85,6 +85,22 @@
         <w:pStyle w:val="ListBullet"/>
       </w:pPr>
       <w:r>
+        <w:t>Partner with the team to turn denied-claim classification models into products that identify reversible denials and recover revenue from health insurance providers.</w:t>
+      </w:r>
+    </w:p>
+    <w:p>
+      <w:pPr>
+        <w:pStyle w:val="ListBullet"/>
+      </w:pPr>
+      <w:r>
+        <w:t>Build forecasting models that predict emergency department patient volumes, so operations teams can plan staffing and allocate resources ahead of demand.</w:t>
+      </w:r>
+    </w:p>
+    <w:p>
+      <w:pPr>
+        <w:pStyle w:val="ListBullet"/>
+      </w:pPr>
+      <w:r>
         <w:t>Design and maintain executive-ready dashboards and recurring reports using Tableau, Power BI, R Shiny, and Streamlit.</w:t>
       </w:r>
     </w:p>
@@ -102,6 +118,71 @@
       </w:pPr>
       <w:r>
         <w:t>Document data definitions, modeling assumptions, and methodologies to ensure reproducibility and audit readiness.</w:t>
+      </w:r>
+    </w:p>
+    <w:p>
+      <w:pPr>
+        <w:spacing w:before="100"/>
+      </w:pPr>
+      <w:r>
+        <w:rPr>
+          <w:b/>
+        </w:rPr>
+        <w:t>Independent AI Engineering · Personal projects</w:t>
+      </w:r>
+      <w:r>
+        <w:rPr>
+          <w:i/>
+        </w:rPr>
+        <w:t xml:space="preserve">    Ongoing</w:t>
+      </w:r>
+    </w:p>
+    <w:p>
+      <w:pPr>
+        <w:pStyle w:val="ListBullet"/>
+      </w:pPr>
+      <w:r>
+        <w:t>Develop software with agentic coding workflows and agent harnesses, directing AI agents to plan, write, test and refactor code, including this interactive portfolio.</w:t>
+      </w:r>
+    </w:p>
+    <w:p>
+      <w:pPr>
+        <w:pStyle w:val="ListBullet"/>
+      </w:pPr>
+      <w:r>
+        <w:t>Work fluently across cloud and local large language models, including Claude, OpenAI, DeepSeek, MiniMax and MiMo, choosing the right model for cost, privacy and quality.</w:t>
+      </w:r>
+    </w:p>
+    <w:p>
+      <w:pPr>
+        <w:pStyle w:val="ListBullet"/>
+      </w:pPr>
+      <w:r>
+        <w:t>Build retrieval-augmented generation (RAG) applications with LangChain that ground model answers in curated document collections.</w:t>
+      </w:r>
+    </w:p>
+    <w:p>
+      <w:pPr>
+        <w:pStyle w:val="ListBullet"/>
+      </w:pPr>
+      <w:r>
+        <w:t>Design data pipelines that collect and clean public datasets, then train, evaluate and fine-tune models on personal workstations.</w:t>
+      </w:r>
+    </w:p>
+    <w:p>
+      <w:pPr>
+        <w:pStyle w:val="ListBullet"/>
+      </w:pPr>
+      <w:r>
+        <w:t>Assemble and maintain personal AI ecosystems from open-source tools, managing multiple systems across my own computers.</w:t>
+      </w:r>
+    </w:p>
+    <w:p>
+      <w:pPr>
+        <w:pStyle w:val="ListBullet"/>
+      </w:pPr>
+      <w:r>
+        <w:t>Apply Laya classification models in projects, and understand how agents and models are built, trained and fine-tuned end to end.</w:t>
       </w:r>
     </w:p>
     <w:p>
@@ -380,6 +461,17 @@
       </w:r>
       <w:r>
         <w:t>Python, SQL, R, JavaScript (incl. D3.js), C++, HTML, CSS, JSON; Machine Learning, Predictive Modeling, EDA, Feature Engineering</w:t>
+      </w:r>
+    </w:p>
+    <w:p>
+      <w:r>
+        <w:rPr>
+          <w:b/>
+        </w:rPr>
+        <w:t xml:space="preserve">AI &amp; Agentic Engineering: </w:t>
+      </w:r>
+      <w:r>
+        <w:t>Agentic coding and agent harnesses; cloud and local LLMs (Claude, OpenAI, DeepSeek, MiniMax, MiMo); retrieval-augmented generation (RAG); LangChain; model fine-tuning; Laya classification models; open-source AI tooling and self-hosted AI systems</w:t>
       </w:r>
     </w:p>
     <w:p>

</xml_diff>

<commit_message>
Regenerate the PDF and DOCX résumé with Jev and the claims impact
Co-Authored-By: Claude Opus 5.5 (1M context) <noreply@anthropic.com>
Claude-Session: https://claude.ai/code/session_019AGMx5GMfQEv44ZBWwXK4A
</commit_message>
<xml_diff>
--- a/JoseLoboPortfolioResume.docx
+++ b/JoseLoboPortfolioResume.docx
@@ -85,7 +85,7 @@
         <w:pStyle w:val="ListBullet"/>
       </w:pPr>
       <w:r>
-        <w:t>Partner with the team to turn denied-claim classification models into products that identify reversible denials and recover revenue from health insurance providers.</w:t>
+        <w:t>Partner with the team to turn denied-claim classification models into products that identify reversible denials, supporting revenue recovery in the tens of millions of dollars from health insurance providers.</w:t>
       </w:r>
     </w:p>
     <w:p>
@@ -182,7 +182,7 @@
         <w:pStyle w:val="ListBullet"/>
       </w:pPr>
       <w:r>
-        <w:t>Apply Laya classification models in projects, and understand how agents and models are built, trained and fine-tuned end to end.</w:t>
+        <w:t>Apply the Laya and Jev classification models in projects, and understand how agents and models are built, trained and fine-tuned end to end.</w:t>
       </w:r>
     </w:p>
     <w:p>
@@ -471,7 +471,7 @@
         <w:t xml:space="preserve">AI &amp; Agentic Engineering: </w:t>
       </w:r>
       <w:r>
-        <w:t>Agentic coding and agent harnesses; cloud and local LLMs (Claude, OpenAI, DeepSeek, MiniMax, MiMo); retrieval-augmented generation (RAG); LangChain; model fine-tuning; Laya classification models; open-source AI tooling and self-hosted AI systems</w:t>
+        <w:t>Agentic coding and agent harnesses; cloud and local LLMs (Claude, OpenAI, DeepSeek, MiniMax, MiMo); retrieval-augmented generation (RAG); LangChain; model fine-tuning; Laya and Jev classification models; open-source AI tooling and self-hosted AI systems</w:t>
       </w:r>
     </w:p>
     <w:p>

</xml_diff>